<commit_message>
chore: harden release artifact packaging
</commit_message>
<xml_diff>
--- a/docs/publications/conferences/ICMSEP2026/ICMSEP-extended-abstract_02.docx
+++ b/docs/publications/conferences/ICMSEP2026/ICMSEP-extended-abstract_02.docx
@@ -8357,19 +8357,4 @@
     </a:ext>
   </a:extLst>
 </a:theme>
-</file>
-
-<file path=customXml/item1.xml><?xml version="1.0" encoding="utf-8"?>
-<go:gDocsCustomXmlDataStorage xmlns:go="http://customooxmlschemas.google.com/" xmlns:r="http://schemas.openxmlformats.org/officeDocument/2006/relationships" uri="GoogleDocsCustomDataVersion2">
-  <go:docsCustomData xmlns:go="http://customooxmlschemas.google.com/" roundtripDataSignature="AMtx7mi9lpIFVNho+xrWBCSMVUlxYAl14Q==">CgMxLjA4AHIhMU5CUXFrQkdqRERfZkZ1ZVhDZ3hQb05DUlNON2Y2aHU3</go:docsCustomData>
-</go:gDocsCustomXmlDataStorage>
-</file>
-
-<file path=customXml/itemProps1.xml><?xml version="1.0" encoding="utf-8"?>
-<ds:datastoreItem xmlns:ds="http://schemas.openxmlformats.org/officeDocument/2006/customXml" ds:itemID="{11111111-1234-1234-1234-123412341234}">
-  <ds:schemaRefs>
-    <ds:schemaRef ds:uri="http://customooxmlschemas.google.com/"/>
-    <ds:schemaRef ds:uri="http://schemas.openxmlformats.org/officeDocument/2006/relationships"/>
-  </ds:schemaRefs>
-</ds:datastoreItem>
 </file>
</xml_diff>